<commit_message>
Add ROSCon Singapore 2025 volunteering with real dates
Fill in the roscon-2025 entry from Ariff's record: Open Robotics, Oct 2025,
and a bullet covering event operations, workshops, logistics and attendee
experience. It was previously dateless and excluded from the mha-drone
variant because it did not fit.

To make room, drop VM Education / Playfacto from the mha-drone variant. Its
MODI curriculum content overlaps the Nullspace entry, which already spans
Jul-Dec 2020, and the To-Do specifies trimming teaching bullets first. The
entry remains in data/experience.yaml and in the full variant.

Co-Authored-By: Claude Opus 5 <noreply@anthropic.com>
</commit_message>
<xml_diff>
--- a/dist/Muhammad_Ariff_Resume.docx
+++ b/dist/Muhammad_Ariff_Resume.docx
@@ -428,13 +428,13 @@
           <w:b/>
           <w:bCs/>
         </w:rPr>
-        <w:t xml:space="preserve">Robotics Instructor &amp; Curriculum Developer, VM Education / Playfacto</w:t>
+        <w:t xml:space="preserve">Technology Instructor (Part Time / Full Time), Nullspace Group</w:t>
       </w:r>
       <w:r>
         <w:br/>
       </w:r>
       <w:r>
-        <w:t xml:space="preserve">Jul 2020 – Dec 2020</w:t>
+        <w:t xml:space="preserve">Nov 2016 – Present</w:t>
       </w:r>
     </w:p>
     <w:p>
@@ -443,36 +443,6 @@
         <w:numPr>
           <w:ilvl w:val="0"/>
           <w:numId w:val="1008"/>
-        </w:numPr>
-      </w:pPr>
-      <w:r>
-        <w:t xml:space="preserve">Pioneered and designed the new coding curriculum for the MODI (Luxrobo) platform in Singapore, publishing 5 projects of varying difficulty.</w:t>
-      </w:r>
-    </w:p>
-    <w:p>
-      <w:pPr>
-        <w:pStyle w:val="EntryHeader"/>
-      </w:pPr>
-      <w:r>
-        <w:rPr>
-          <w:b/>
-          <w:bCs/>
-        </w:rPr>
-        <w:t xml:space="preserve">Technology Instructor (Part Time / Full Time), Nullspace Group</w:t>
-      </w:r>
-      <w:r>
-        <w:br/>
-      </w:r>
-      <w:r>
-        <w:t xml:space="preserve">Nov 2016 – Present</w:t>
-      </w:r>
-    </w:p>
-    <w:p>
-      <w:pPr>
-        <w:pStyle w:val="Compact"/>
-        <w:numPr>
-          <w:ilvl w:val="0"/>
-          <w:numId w:val="1009"/>
         </w:numPr>
       </w:pPr>
       <w:r>
@@ -512,7 +482,7 @@
         <w:pStyle w:val="Compact"/>
         <w:numPr>
           <w:ilvl w:val="0"/>
-          <w:numId w:val="1010"/>
+          <w:numId w:val="1009"/>
         </w:numPr>
       </w:pPr>
       <w:r>
@@ -524,7 +494,7 @@
         <w:pStyle w:val="Compact"/>
         <w:numPr>
           <w:ilvl w:val="0"/>
-          <w:numId w:val="1010"/>
+          <w:numId w:val="1009"/>
         </w:numPr>
       </w:pPr>
       <w:r>
@@ -554,7 +524,7 @@
         <w:pStyle w:val="Compact"/>
         <w:numPr>
           <w:ilvl w:val="0"/>
-          <w:numId w:val="1011"/>
+          <w:numId w:val="1010"/>
         </w:numPr>
       </w:pPr>
       <w:r>
@@ -566,7 +536,7 @@
         <w:pStyle w:val="Compact"/>
         <w:numPr>
           <w:ilvl w:val="0"/>
-          <w:numId w:val="1011"/>
+          <w:numId w:val="1010"/>
         </w:numPr>
       </w:pPr>
       <w:r>
@@ -596,7 +566,7 @@
         <w:pStyle w:val="Compact"/>
         <w:numPr>
           <w:ilvl w:val="0"/>
-          <w:numId w:val="1012"/>
+          <w:numId w:val="1011"/>
         </w:numPr>
       </w:pPr>
       <w:r>
@@ -608,7 +578,7 @@
         <w:pStyle w:val="Compact"/>
         <w:numPr>
           <w:ilvl w:val="0"/>
-          <w:numId w:val="1012"/>
+          <w:numId w:val="1011"/>
         </w:numPr>
       </w:pPr>
       <w:r>
@@ -730,7 +700,7 @@
         <w:pStyle w:val="Compact"/>
         <w:numPr>
           <w:ilvl w:val="0"/>
-          <w:numId w:val="1013"/>
+          <w:numId w:val="1012"/>
         </w:numPr>
       </w:pPr>
       <w:r>
@@ -745,6 +715,36 @@
       </w:pPr>
       <w:r>
         <w:t xml:space="preserve">VOLUNTEERING &amp; COMMUNITY SERVICE</w:t>
+      </w:r>
+    </w:p>
+    <w:p>
+      <w:pPr>
+        <w:pStyle w:val="EntryHeader"/>
+      </w:pPr>
+      <w:r>
+        <w:rPr>
+          <w:b/>
+          <w:bCs/>
+        </w:rPr>
+        <w:t xml:space="preserve">ROSCon Singapore 2025 (Open Robotics) — Volunteer</w:t>
+      </w:r>
+      <w:r>
+        <w:br/>
+      </w:r>
+      <w:r>
+        <w:t xml:space="preserve">Oct 2025</w:t>
+      </w:r>
+    </w:p>
+    <w:p>
+      <w:pPr>
+        <w:pStyle w:val="Compact"/>
+        <w:numPr>
+          <w:ilvl w:val="0"/>
+          <w:numId w:val="1013"/>
+        </w:numPr>
+      </w:pPr>
+      <w:r>
+        <w:t xml:space="preserve">Supported event operations, workshops, logistics, and attendee experience at ROSCon Singapore 2025, the annual ROS developer conference.</w:t>
       </w:r>
     </w:p>
     <w:p>

</xml_diff>

<commit_message>
Update resume data, templates and build; add summary and keyword notes
Rename mha-drone output to Muhammad_Ariff_Resume, archive earlier additional data, add data/summary.yaml and HighImpactKeywords.md, refresh dist outputs.

Co-Authored-By: Claude Sonnet 5.5 <noreply@anthropic.com>
</commit_message>
<xml_diff>
--- a/dist/Muhammad_Ariff_Resume.docx
+++ b/dist/Muhammad_Ariff_Resume.docx
@@ -22,7 +22,425 @@
         <w:t xml:space="preserve">+65 96579407 | muhdariffrazak00@gmail.com | www.linkedin.com/in/muhd-ariff-razak | Singapore</w:t>
       </w:r>
     </w:p>
-    <w:bookmarkStart w:id="20" w:name="projects"/>
+    <w:p>
+      <w:pPr>
+        <w:pStyle w:val="BodyText"/>
+      </w:pPr>
+      <w:r>
+        <w:t xml:space="preserve">Systems Engineer with a foundation in robotics, embedded systems, and machine learning. Twenty-two months in the Singapore Police Force’s Protective Security Command gave a first-hand view of how Home Team operations run, and the work since has stayed close to those problems — benchmarking AI-generated media detectors as a public-safety threat, and now leading a quiet-drone capstone with MHA as its end user. Drawn to engineering where reliability is the point, and to contributing that to public safety directly.</w:t>
+      </w:r>
+    </w:p>
+    <w:bookmarkStart w:id="20" w:name="work-experience"/>
+    <w:p>
+      <w:pPr>
+        <w:pStyle w:val="Heading1"/>
+      </w:pPr>
+      <w:r>
+        <w:t xml:space="preserve">WORK EXPERIENCE</w:t>
+      </w:r>
+    </w:p>
+    <w:p>
+      <w:pPr>
+        <w:pStyle w:val="EntryHeader"/>
+      </w:pPr>
+      <w:r>
+        <w:rPr>
+          <w:b/>
+          <w:bCs/>
+        </w:rPr>
+        <w:t xml:space="preserve">KLASS Engineering and Solutions</w:t>
+      </w:r>
+      <w:r>
+        <w:br/>
+      </w:r>
+      <w:r>
+        <w:t xml:space="preserve">Machine Learning &amp; Fullstack Engineer (Intern)</w:t>
+      </w:r>
+      <w:r>
+        <w:br/>
+      </w:r>
+      <w:r>
+        <w:t xml:space="preserve">Sep 2025 – Aug 2026</w:t>
+      </w:r>
+    </w:p>
+    <w:p>
+      <w:pPr>
+        <w:pStyle w:val="Compact"/>
+        <w:numPr>
+          <w:ilvl w:val="0"/>
+          <w:numId w:val="1001"/>
+        </w:numPr>
+      </w:pPr>
+      <w:r>
+        <w:t xml:space="preserve">Reproduced and benchmarked state-of-the-art AI-generated video and audio detectors (NSG-VD, D3, ReStraV, SpeechForensics) on SLURM-based HPC to assess detection capability against AI-generated media as a public-safety threat, achieving 90.03 AUROC on the NSG-VD replication.</w:t>
+      </w:r>
+    </w:p>
+    <w:p>
+      <w:pPr>
+        <w:pStyle w:val="Compact"/>
+        <w:numPr>
+          <w:ilvl w:val="0"/>
+          <w:numId w:val="1001"/>
+        </w:numPr>
+      </w:pPr>
+      <w:r>
+        <w:t xml:space="preserve">Ran ablation studies integrating optical flow (RAFT), segmentation (SAM 2), and point tracking (CoTracker) to test whether physical-motion signals in video sequences can distinguish AI-generated content, finding mixed evidence of a usable signal.</w:t>
+      </w:r>
+    </w:p>
+    <w:p>
+      <w:pPr>
+        <w:pStyle w:val="Compact"/>
+        <w:numPr>
+          <w:ilvl w:val="0"/>
+          <w:numId w:val="1001"/>
+        </w:numPr>
+      </w:pPr>
+      <w:r>
+        <w:t xml:space="preserve">Engineered a data generation pipeline chaining video extension (Wan2.2), voice cloning (Chatterbox), and lip-sync (LatentSync) models to curate a balanced 1,200-video real/fake dataset, used to compare all four detectors consistently and to test models at small scale before committing larger compute.</w:t>
+      </w:r>
+    </w:p>
+    <w:p>
+      <w:pPr>
+        <w:pStyle w:val="Compact"/>
+        <w:numPr>
+          <w:ilvl w:val="0"/>
+          <w:numId w:val="1001"/>
+        </w:numPr>
+      </w:pPr>
+      <w:r>
+        <w:t xml:space="preserve">Managed GPU-accelerated experimentation on shared SLURM clusters (NVIDIA H200 nodes) via Docker containers, running sanity-check protocols on custom validation splits that caught pipeline errors before committing to training and synthetic-deepfake generation runs of up to 5 hours each.</w:t>
+      </w:r>
+    </w:p>
+    <w:p>
+      <w:pPr>
+        <w:pStyle w:val="Compact"/>
+        <w:numPr>
+          <w:ilvl w:val="0"/>
+          <w:numId w:val="1001"/>
+        </w:numPr>
+      </w:pPr>
+      <w:r>
+        <w:t xml:space="preserve">Built React frontend components and FastAPI backend services with WebSockets for real-time streaming responses, deploying multi-model AI endpoints for a company-wide internal AI chatbot platform that gave staff a secure alternative to public AI tools, with search across internal documents.</w:t>
+      </w:r>
+    </w:p>
+    <w:p>
+      <w:pPr>
+        <w:pStyle w:val="EntryHeader"/>
+      </w:pPr>
+      <w:r>
+        <w:rPr>
+          <w:b/>
+          <w:bCs/>
+        </w:rPr>
+        <w:t xml:space="preserve">Singapore Institute of Technology (SIT)</w:t>
+      </w:r>
+      <w:r>
+        <w:br/>
+      </w:r>
+      <w:r>
+        <w:t xml:space="preserve">Student Research Engineer</w:t>
+      </w:r>
+      <w:r>
+        <w:br/>
+      </w:r>
+      <w:r>
+        <w:t xml:space="preserve">Aug 2024 – May 2025</w:t>
+      </w:r>
+    </w:p>
+    <w:p>
+      <w:pPr>
+        <w:pStyle w:val="Compact"/>
+        <w:numPr>
+          <w:ilvl w:val="0"/>
+          <w:numId w:val="1002"/>
+        </w:numPr>
+      </w:pPr>
+      <w:r>
+        <w:t xml:space="preserve">Designed and built a temperature-controlled enclosure around a compression testing machine for faculty research on how foods behave during chewing, defining the electrical architecture and selecting components before handing the completed chamber over to the research team.</w:t>
+      </w:r>
+    </w:p>
+    <w:p>
+      <w:pPr>
+        <w:pStyle w:val="Compact"/>
+        <w:numPr>
+          <w:ilvl w:val="0"/>
+          <w:numId w:val="1002"/>
+        </w:numPr>
+      </w:pPr>
+      <w:r>
+        <w:t xml:space="preserve">Engineered closed-loop temperature control with a thermistor and standalone temperature controller, holding the chamber within ±2 °C of a 37 °C body-temperature setpoint for consistent test conditions.</w:t>
+      </w:r>
+    </w:p>
+    <w:p>
+      <w:pPr>
+        <w:pStyle w:val="EntryHeader"/>
+      </w:pPr>
+      <w:r>
+        <w:rPr>
+          <w:b/>
+          <w:bCs/>
+        </w:rPr>
+        <w:t xml:space="preserve">SUTD – ROAR Lab</w:t>
+      </w:r>
+      <w:r>
+        <w:br/>
+      </w:r>
+      <w:r>
+        <w:t xml:space="preserve">Research Assistant</w:t>
+      </w:r>
+      <w:r>
+        <w:br/>
+      </w:r>
+      <w:r>
+        <w:t xml:space="preserve">Aug 2022 – May 2024 (Volunteer until Nov 2022, Full Time thereafter)</w:t>
+      </w:r>
+    </w:p>
+    <w:p>
+      <w:pPr>
+        <w:pStyle w:val="Compact"/>
+        <w:numPr>
+          <w:ilvl w:val="0"/>
+          <w:numId w:val="1003"/>
+        </w:numPr>
+      </w:pPr>
+      <w:r>
+        <w:t xml:space="preserve">Led the design of Panthera’s intelligent lighting control system to signal the autonomous vehicle’s intent to pedestrians and meet testing safety requirements, running a rosserial node on an Arduino under an RTOS that mapped cmd_vel, IMU, and vehicle-state topics to turn, warning, and hazard signals; the platform passed T1 autonomous testing at CETRAN.</w:t>
+      </w:r>
+    </w:p>
+    <w:p>
+      <w:pPr>
+        <w:pStyle w:val="Compact"/>
+        <w:numPr>
+          <w:ilvl w:val="0"/>
+          <w:numId w:val="1003"/>
+        </w:numPr>
+      </w:pPr>
+      <w:r>
+        <w:t xml:space="preserve">Wired and integrated the 3D LiDAR used for Panthera’s obstacle detection, mapping, and localization, verifying sensor output through depth-map visualization, and supported the vehicle through its T1 autonomous field testing.</w:t>
+      </w:r>
+    </w:p>
+    <w:p>
+      <w:pPr>
+        <w:pStyle w:val="EntryHeader"/>
+      </w:pPr>
+      <w:r>
+        <w:rPr>
+          <w:b/>
+          <w:bCs/>
+        </w:rPr>
+        <w:t xml:space="preserve">Singapore Police Force – Protective Security Command</w:t>
+      </w:r>
+      <w:r>
+        <w:br/>
+      </w:r>
+      <w:r>
+        <w:t xml:space="preserve">Trooper &amp; Armourer</w:t>
+      </w:r>
+      <w:r>
+        <w:br/>
+      </w:r>
+      <w:r>
+        <w:t xml:space="preserve">Jan 2021 – Nov 2022 (Full-Time National Service)</w:t>
+      </w:r>
+    </w:p>
+    <w:p>
+      <w:pPr>
+        <w:pStyle w:val="Compact"/>
+        <w:numPr>
+          <w:ilvl w:val="0"/>
+          <w:numId w:val="1004"/>
+        </w:numPr>
+      </w:pPr>
+      <w:r>
+        <w:t xml:space="preserve">Performed protective security duties within a deployed team at strategic locations and major national events, operating under strict standard operating procedures across 22 months of full-time service.</w:t>
+      </w:r>
+    </w:p>
+    <w:p>
+      <w:pPr>
+        <w:pStyle w:val="Compact"/>
+        <w:numPr>
+          <w:ilvl w:val="0"/>
+          <w:numId w:val="1004"/>
+        </w:numPr>
+      </w:pPr>
+      <w:r>
+        <w:t xml:space="preserve">Served as unit Armourer alongside trooper duties, managing the issuance, return, and accountability of arms and equipment with zero discrepancies, and maintaining audit-ready records under regulated inventory procedures.</w:t>
+      </w:r>
+    </w:p>
+    <w:p>
+      <w:pPr>
+        <w:pStyle w:val="EntryHeader"/>
+      </w:pPr>
+      <w:r>
+        <w:rPr>
+          <w:b/>
+          <w:bCs/>
+        </w:rPr>
+        <w:t xml:space="preserve">SOLUSTAR</w:t>
+      </w:r>
+      <w:r>
+        <w:br/>
+      </w:r>
+      <w:r>
+        <w:t xml:space="preserve">Robotics Engineer Intern (Unpaid, Part Time)</w:t>
+      </w:r>
+      <w:r>
+        <w:br/>
+      </w:r>
+      <w:r>
+        <w:t xml:space="preserve">May 2022 – Aug 2022</w:t>
+      </w:r>
+    </w:p>
+    <w:p>
+      <w:pPr>
+        <w:pStyle w:val="Compact"/>
+        <w:numPr>
+          <w:ilvl w:val="0"/>
+          <w:numId w:val="1005"/>
+        </w:numPr>
+      </w:pPr>
+      <w:r>
+        <w:t xml:space="preserve">Designed and debugged PCBs and circuitry for a disinfectant robot, bringing the boards into a working prototype.</w:t>
+      </w:r>
+    </w:p>
+    <w:bookmarkEnd w:id="20"/>
+    <w:bookmarkStart w:id="21" w:name="education"/>
+    <w:p>
+      <w:pPr>
+        <w:pStyle w:val="Heading1"/>
+      </w:pPr>
+      <w:r>
+        <w:t xml:space="preserve">EDUCATION</w:t>
+      </w:r>
+    </w:p>
+    <w:p>
+      <w:pPr>
+        <w:pStyle w:val="EntryHeader"/>
+      </w:pPr>
+      <w:r>
+        <w:rPr>
+          <w:b/>
+          <w:bCs/>
+        </w:rPr>
+        <w:t xml:space="preserve">DigiPen Institute of Technology &amp; SIT</w:t>
+      </w:r>
+      <w:r>
+        <w:br/>
+      </w:r>
+      <w:r>
+        <w:t xml:space="preserve">Aug 2023 – May 2027</w:t>
+      </w:r>
+    </w:p>
+    <w:p>
+      <w:pPr>
+        <w:pStyle w:val="Compact"/>
+        <w:numPr>
+          <w:ilvl w:val="0"/>
+          <w:numId w:val="1006"/>
+        </w:numPr>
+      </w:pPr>
+      <w:r>
+        <w:t xml:space="preserve">B.Eng. Mechatronics Systems</w:t>
+      </w:r>
+    </w:p>
+    <w:p>
+      <w:pPr>
+        <w:pStyle w:val="Compact"/>
+        <w:numPr>
+          <w:ilvl w:val="0"/>
+          <w:numId w:val="1006"/>
+        </w:numPr>
+      </w:pPr>
+      <w:r>
+        <w:t xml:space="preserve">Relevant Coursework: Mechanics, Control Systems, Robotics, Embedded Systems, Machine Learning, Systems and Software Engineering</w:t>
+      </w:r>
+    </w:p>
+    <w:p>
+      <w:pPr>
+        <w:pStyle w:val="EntryHeader"/>
+      </w:pPr>
+      <w:r>
+        <w:rPr>
+          <w:b/>
+          <w:bCs/>
+        </w:rPr>
+        <w:t xml:space="preserve">Ngee Ann Polytechnic</w:t>
+      </w:r>
+      <w:r>
+        <w:br/>
+      </w:r>
+      <w:r>
+        <w:t xml:space="preserve">Sep 2022 – Sep 2023</w:t>
+      </w:r>
+    </w:p>
+    <w:p>
+      <w:pPr>
+        <w:pStyle w:val="Compact"/>
+        <w:numPr>
+          <w:ilvl w:val="0"/>
+          <w:numId w:val="1007"/>
+        </w:numPr>
+      </w:pPr>
+      <w:r>
+        <w:t xml:space="preserve">Specialist Diploma in Robotics Engineering (SGInnovate PowerX)</w:t>
+      </w:r>
+    </w:p>
+    <w:p>
+      <w:pPr>
+        <w:pStyle w:val="Compact"/>
+        <w:numPr>
+          <w:ilvl w:val="0"/>
+          <w:numId w:val="1007"/>
+        </w:numPr>
+      </w:pPr>
+      <w:r>
+        <w:t xml:space="preserve">Relevant Coursework: Autonomous Robot Navigation, Machine Learning/Deep Learning for Robotics, Computer Vision</w:t>
+      </w:r>
+    </w:p>
+    <w:p>
+      <w:pPr>
+        <w:pStyle w:val="EntryHeader"/>
+      </w:pPr>
+      <w:r>
+        <w:rPr>
+          <w:b/>
+          <w:bCs/>
+        </w:rPr>
+        <w:t xml:space="preserve">Singapore Polytechnic</w:t>
+      </w:r>
+      <w:r>
+        <w:br/>
+      </w:r>
+      <w:r>
+        <w:t xml:space="preserve">Apr 2017 – Sep 2020</w:t>
+      </w:r>
+    </w:p>
+    <w:p>
+      <w:pPr>
+        <w:pStyle w:val="Compact"/>
+        <w:numPr>
+          <w:ilvl w:val="0"/>
+          <w:numId w:val="1008"/>
+        </w:numPr>
+      </w:pPr>
+      <w:r>
+        <w:t xml:space="preserve">Diploma in Mechatronics and Robotics</w:t>
+      </w:r>
+    </w:p>
+    <w:p>
+      <w:pPr>
+        <w:pStyle w:val="Compact"/>
+        <w:numPr>
+          <w:ilvl w:val="0"/>
+          <w:numId w:val="1008"/>
+        </w:numPr>
+      </w:pPr>
+      <w:r>
+        <w:t xml:space="preserve">Relevant Coursework: Microcontroller Applications, PLCs, and Robotics Integration</w:t>
+      </w:r>
+    </w:p>
+    <w:bookmarkEnd w:id="21"/>
+    <w:bookmarkStart w:id="22" w:name="projects"/>
     <w:p>
       <w:pPr>
         <w:pStyle w:val="Heading1"/>
@@ -43,15 +461,15 @@
         <w:t xml:space="preserve">1. Capstone (MET4004) — Acoustic Noise Reduction for Drones</w:t>
       </w:r>
       <w:r>
-        <w:t xml:space="preserve"> </w:t>
-      </w:r>
-      <w:r>
-        <w:t xml:space="preserve">— Project Lead — Software &amp; Electronics (KLASS)</w:t>
-      </w:r>
-      <w:r>
         <w:br/>
       </w:r>
       <w:r>
+        <w:t xml:space="preserve">Project Lead, Software &amp; Electronics (Sponsored by KLASS)</w:t>
+      </w:r>
+      <w:r>
+        <w:br/>
+      </w:r>
+      <w:r>
         <w:t xml:space="preserve">Aug 2026 – Apr 2027</w:t>
       </w:r>
     </w:p>
@@ -60,19 +478,19 @@
         <w:pStyle w:val="Compact"/>
         <w:numPr>
           <w:ilvl w:val="0"/>
-          <w:numId w:val="1001"/>
-        </w:numPr>
-      </w:pPr>
-      <w:r>
-        <w:t xml:space="preserve">Leading a 3-person team to deliver a proof-of-concept indoor drone for industry sponsor KLASS, targeting a 78 dBA ceiling at a 1 m reference during steady hover, 10-minute hover endurance, and a 370 mm square airframe envelope.</w:t>
-      </w:r>
-    </w:p>
-    <w:p>
-      <w:pPr>
-        <w:pStyle w:val="Compact"/>
-        <w:numPr>
-          <w:ilvl w:val="0"/>
-          <w:numId w:val="1001"/>
+          <w:numId w:val="1009"/>
+        </w:numPr>
+      </w:pPr>
+      <w:r>
+        <w:t xml:space="preserve">Leading a 3-person team to deliver a proof-of-concept quiet indoor drone for end user MHA to reduce acoustic detectability, targeting a 78 dBA ceiling at a 1 m reference during steady hover, 10-minute hover endurance, and a 370 mm square airframe envelope, with the project proposal approved.</w:t>
+      </w:r>
+    </w:p>
+    <w:p>
+      <w:pPr>
+        <w:pStyle w:val="Compact"/>
+        <w:numPr>
+          <w:ilvl w:val="0"/>
+          <w:numId w:val="1009"/>
         </w:numPr>
       </w:pPr>
       <w:r>
@@ -84,35 +502,35 @@
         <w:pStyle w:val="Compact"/>
         <w:numPr>
           <w:ilvl w:val="0"/>
-          <w:numId w:val="1001"/>
-        </w:numPr>
-      </w:pPr>
-      <w:r>
-        <w:t xml:space="preserve">Specified the avionics and power architecture (Holybro Pixhawk 6C Mini, PM02 V2 power module, dedicated 150 A power distribution board), yielding a derated 3.3:1 thrust-to-weight ratio at 1,200 g all-up weight for stable station-keeping in GPS-denied indoor flight.</w:t>
-      </w:r>
-    </w:p>
-    <w:p>
-      <w:pPr>
-        <w:pStyle w:val="Compact"/>
-        <w:numPr>
-          <w:ilvl w:val="0"/>
-          <w:numId w:val="1001"/>
-        </w:numPr>
-      </w:pPr>
-      <w:r>
-        <w:t xml:space="preserve">Designed the acoustic validation campaign to the Von Karman Institute four-microphone methodology with TU Berlin distance normalization to a 1 m reference, enabling direct benchmarking against HKUST’s 90.52 dBA commercial quadcopter baseline and VKI’s DJI Phantom 3 SE measurements.</w:t>
-      </w:r>
-    </w:p>
-    <w:p>
-      <w:pPr>
-        <w:pStyle w:val="Compact"/>
-        <w:numPr>
-          <w:ilvl w:val="0"/>
-          <w:numId w:val="1001"/>
-        </w:numPr>
-      </w:pPr>
-      <w:r>
-        <w:t xml:space="preserve">Specified psychoacoustic post-processing in Python (MoSQITo) under both Zwicker (ISO 532-1) and Moore–Glasberg (ISO 532-2) loudness standards, quantifying perceived annoyance beyond raw sound-pressure level.</w:t>
+          <w:numId w:val="1009"/>
+        </w:numPr>
+      </w:pPr>
+      <w:r>
+        <w:t xml:space="preserve">Specified the avionics and power architecture (Holybro Pixhawk 6C Mini, PM02 V2 power module, dedicated 150 A power distribution board), yielding a derated 3.3:1 thrust-to-weight ratio at 1,200 g all-up weight to preserve control headroom for manually piloted indoor flight.</w:t>
+      </w:r>
+    </w:p>
+    <w:p>
+      <w:pPr>
+        <w:pStyle w:val="Compact"/>
+        <w:numPr>
+          <w:ilvl w:val="0"/>
+          <w:numId w:val="1009"/>
+        </w:numPr>
+      </w:pPr>
+      <w:r>
+        <w:t xml:space="preserve">Designed the acoustic validation plan to the Von Karman Institute four-microphone methodology with TU Berlin distance normalization to a 1 m reference, to benchmark directly against HKUST’s 90.52 dBA commercial quadcopter baseline and VKI’s DJI Phantom 3 SE measurements.</w:t>
+      </w:r>
+    </w:p>
+    <w:p>
+      <w:pPr>
+        <w:pStyle w:val="Compact"/>
+        <w:numPr>
+          <w:ilvl w:val="0"/>
+          <w:numId w:val="1009"/>
+        </w:numPr>
+      </w:pPr>
+      <w:r>
+        <w:t xml:space="preserve">Specified psychoacoustic post-processing in Python (MoSQITo) under both Zwicker (ISO 532-1) and Moore–Glasberg (ISO 532-2) loudness standards to quantify perceived annoyance beyond raw sound-pressure level.</w:t>
       </w:r>
     </w:p>
     <w:p>
@@ -124,399 +542,13 @@
           <w:b/>
           <w:bCs/>
         </w:rPr>
-        <w:t xml:space="preserve">2. Autonomous Trolley Collection Robot</w:t>
-      </w:r>
-    </w:p>
-    <w:p>
-      <w:pPr>
-        <w:pStyle w:val="Compact"/>
-        <w:numPr>
-          <w:ilvl w:val="0"/>
-          <w:numId w:val="1002"/>
-        </w:numPr>
-      </w:pPr>
-      <w:r>
-        <w:t xml:space="preserve">Developed an autonomous robot for collecting stray trolleys on an STM32F7 microcontroller running an RTOS, implementing concurrent tasks for obstacle detection and joystick control over a custom serial communication protocol.</w:t>
-      </w:r>
-    </w:p>
-    <w:bookmarkEnd w:id="20"/>
-    <w:bookmarkStart w:id="21" w:name="work-experience"/>
-    <w:p>
-      <w:pPr>
-        <w:pStyle w:val="Heading1"/>
-      </w:pPr>
-      <w:r>
-        <w:t xml:space="preserve">WORK EXPERIENCE</w:t>
-      </w:r>
-    </w:p>
-    <w:p>
-      <w:pPr>
-        <w:pStyle w:val="EntryHeader"/>
-      </w:pPr>
-      <w:r>
-        <w:rPr>
-          <w:b/>
-          <w:bCs/>
-        </w:rPr>
-        <w:t xml:space="preserve">Machine Learning &amp; Fullstack Engineer (Intern), KLASS Engineering and Solutions</w:t>
+        <w:t xml:space="preserve">2. Autonomous Airport Trolley Return Robot (SIT–DigiPen Coursework)</w:t>
       </w:r>
       <w:r>
         <w:br/>
       </w:r>
       <w:r>
-        <w:t xml:space="preserve">Sep 2025 – Aug 2026</w:t>
-      </w:r>
-    </w:p>
-    <w:p>
-      <w:pPr>
-        <w:pStyle w:val="Compact"/>
-        <w:numPr>
-          <w:ilvl w:val="0"/>
-          <w:numId w:val="1003"/>
-        </w:numPr>
-      </w:pPr>
-      <w:r>
-        <w:t xml:space="preserve">Reproduced and benchmarked state-of-the-art AI-generated video and audio detectors (NSG-VD, D3, ReStraV, SpeechForensics) on SLURM-based HPC, achieving 90.03 AUROC on the NSG-VD replication.</w:t>
-      </w:r>
-    </w:p>
-    <w:p>
-      <w:pPr>
-        <w:pStyle w:val="Compact"/>
-        <w:numPr>
-          <w:ilvl w:val="0"/>
-          <w:numId w:val="1003"/>
-        </w:numPr>
-      </w:pPr>
-      <w:r>
-        <w:t xml:space="preserve">Integrated optical flow (RAFT), segmentation (SAM 2), and point-tracking (CoTracker) algorithms to analyze physical motion derivatives in video sequences for mission-critical data.</w:t>
-      </w:r>
-    </w:p>
-    <w:p>
-      <w:pPr>
-        <w:pStyle w:val="Compact"/>
-        <w:numPr>
-          <w:ilvl w:val="0"/>
-          <w:numId w:val="1003"/>
-        </w:numPr>
-      </w:pPr>
-      <w:r>
-        <w:t xml:space="preserve">Engineered a data generation pipeline chaining video extension (Wan2.2), voice cloning (Chatterbox), and lip-synchronization (LatentSync) models to curate a balanced 1,200-video benchmark dataset.</w:t>
-      </w:r>
-    </w:p>
-    <w:p>
-      <w:pPr>
-        <w:pStyle w:val="Compact"/>
-        <w:numPr>
-          <w:ilvl w:val="0"/>
-          <w:numId w:val="1003"/>
-        </w:numPr>
-      </w:pPr>
-      <w:r>
-        <w:t xml:space="preserve">Managed GPU-accelerated experimentation on shared SLURM clusters (NVIDIA H200 nodes) via Docker containers, running sanity-check protocols on custom validation splits before committing cluster time to full-scale benchmarking runs.</w:t>
-      </w:r>
-    </w:p>
-    <w:p>
-      <w:pPr>
-        <w:pStyle w:val="Compact"/>
-        <w:numPr>
-          <w:ilvl w:val="0"/>
-          <w:numId w:val="1003"/>
-        </w:numPr>
-      </w:pPr>
-      <w:r>
-        <w:t xml:space="preserve">Built React frontend components and FastAPI backend services with WebSockets for real-time streaming responses, deploying multi-model AI endpoints for an internal AI chatbot platform.</w:t>
-      </w:r>
-    </w:p>
-    <w:p>
-      <w:pPr>
-        <w:pStyle w:val="EntryHeader"/>
-      </w:pPr>
-      <w:r>
-        <w:rPr>
-          <w:b/>
-          <w:bCs/>
-        </w:rPr>
-        <w:t xml:space="preserve">Student Research Engineer, Singapore Institute of Technology (SIT)</w:t>
-      </w:r>
-      <w:r>
-        <w:br/>
-      </w:r>
-      <w:r>
-        <w:t xml:space="preserve">Aug 2024 – May 2025</w:t>
-      </w:r>
-    </w:p>
-    <w:p>
-      <w:pPr>
-        <w:pStyle w:val="Compact"/>
-        <w:numPr>
-          <w:ilvl w:val="0"/>
-          <w:numId w:val="1004"/>
-        </w:numPr>
-      </w:pPr>
-      <w:r>
-        <w:t xml:space="preserve">Designed and built an experimental temperature chamber simulating human body heat signatures and extreme physical environments for faculty-led embodied AI and robotics hardware testing.</w:t>
-      </w:r>
-    </w:p>
-    <w:p>
-      <w:pPr>
-        <w:pStyle w:val="Compact"/>
-        <w:numPr>
-          <w:ilvl w:val="0"/>
-          <w:numId w:val="1004"/>
-        </w:numPr>
-      </w:pPr>
-      <w:r>
-        <w:t xml:space="preserve">Engineered a closed-loop, thermistor-based IoT control system to hold chamber temperature at setpoint, enabling high-fidelity data collection.</w:t>
-      </w:r>
-    </w:p>
-    <w:p>
-      <w:pPr>
-        <w:pStyle w:val="Compact"/>
-        <w:numPr>
-          <w:ilvl w:val="0"/>
-          <w:numId w:val="1004"/>
-        </w:numPr>
-      </w:pPr>
-      <w:r>
-        <w:t xml:space="preserve">Established repeatable testing and data collection protocols for faculty-led embodied AI and robotics hardware projects.</w:t>
-      </w:r>
-    </w:p>
-    <w:p>
-      <w:pPr>
-        <w:pStyle w:val="EntryHeader"/>
-      </w:pPr>
-      <w:r>
-        <w:rPr>
-          <w:b/>
-          <w:bCs/>
-        </w:rPr>
-        <w:t xml:space="preserve">Research Assistant (Full Time / Volunteer), SUTD – ROAR Lab</w:t>
-      </w:r>
-      <w:r>
-        <w:br/>
-      </w:r>
-      <w:r>
-        <w:t xml:space="preserve">Aug 2022 – May 2024</w:t>
-      </w:r>
-    </w:p>
-    <w:p>
-      <w:pPr>
-        <w:pStyle w:val="Compact"/>
-        <w:numPr>
-          <w:ilvl w:val="0"/>
-          <w:numId w:val="1005"/>
-        </w:numPr>
-      </w:pPr>
-      <w:r>
-        <w:t xml:space="preserve">Developed perception software processing 3D LiDAR data for autonomous mobile robots, designing architectures integrating Embedded C++, ROS, and sensor fusion.</w:t>
-      </w:r>
-    </w:p>
-    <w:p>
-      <w:pPr>
-        <w:pStyle w:val="Compact"/>
-        <w:numPr>
-          <w:ilvl w:val="0"/>
-          <w:numId w:val="1005"/>
-        </w:numPr>
-      </w:pPr>
-      <w:r>
-        <w:t xml:space="preserve">Led the design of the full intelligent lighting control system for Panthera, an autonomous vehicle developed under National Robotics Programme funding, implementing it as a rosserial node on an Arduino that subscribed to cmd_vel, IMU, and vehicle-state topics under an RTOS to drive turn, warning, and hazard signaling; the platform passed T1 autonomous testing at CETRAN.</w:t>
-      </w:r>
-    </w:p>
-    <w:p>
-      <w:pPr>
-        <w:pStyle w:val="Compact"/>
-        <w:numPr>
-          <w:ilvl w:val="0"/>
-          <w:numId w:val="1005"/>
-        </w:numPr>
-      </w:pPr>
-      <w:r>
-        <w:t xml:space="preserve">Built a predictive safety model to detect a stair-climbing robot’s fall risk, deploying Long Short-Term Memory networks (LSTMs) over sensor time-series data.</w:t>
-      </w:r>
-    </w:p>
-    <w:p>
-      <w:pPr>
-        <w:pStyle w:val="EntryHeader"/>
-      </w:pPr>
-      <w:r>
-        <w:rPr>
-          <w:b/>
-          <w:bCs/>
-        </w:rPr>
-        <w:t xml:space="preserve">Trooper &amp; Armourer, Singapore Police Force – Protective Security Command</w:t>
-      </w:r>
-      <w:r>
-        <w:br/>
-      </w:r>
-      <w:r>
-        <w:t xml:space="preserve">Jan 2021 – Nov 2022 (Full-Time National Service)</w:t>
-      </w:r>
-    </w:p>
-    <w:p>
-      <w:pPr>
-        <w:pStyle w:val="Compact"/>
-        <w:numPr>
-          <w:ilvl w:val="0"/>
-          <w:numId w:val="1006"/>
-        </w:numPr>
-      </w:pPr>
-      <w:r>
-        <w:t xml:space="preserve">Performed protective security duties as part of a deployed team, operating under strict standard operating procedures to protect strategic locations and major national events across 22 months of full-time service.</w:t>
-      </w:r>
-    </w:p>
-    <w:p>
-      <w:pPr>
-        <w:pStyle w:val="Compact"/>
-        <w:numPr>
-          <w:ilvl w:val="0"/>
-          <w:numId w:val="1006"/>
-        </w:numPr>
-      </w:pPr>
-      <w:r>
-        <w:t xml:space="preserve">Served as unit Armourer alongside trooper duties, managing the issuance, return, and accountability of arms and equipment, and maintaining audit-ready records against regulated inventory procedures.</w:t>
-      </w:r>
-    </w:p>
-    <w:p>
-      <w:pPr>
-        <w:pStyle w:val="EntryHeader"/>
-      </w:pPr>
-      <w:r>
-        <w:rPr>
-          <w:b/>
-          <w:bCs/>
-        </w:rPr>
-        <w:t xml:space="preserve">Robotics Engineer Intern, SOLUSTAR</w:t>
-      </w:r>
-      <w:r>
-        <w:br/>
-      </w:r>
-      <w:r>
-        <w:t xml:space="preserve">May 2022 – Aug 2022</w:t>
-      </w:r>
-    </w:p>
-    <w:p>
-      <w:pPr>
-        <w:pStyle w:val="Compact"/>
-        <w:numPr>
-          <w:ilvl w:val="0"/>
-          <w:numId w:val="1007"/>
-        </w:numPr>
-      </w:pPr>
-      <w:r>
-        <w:t xml:space="preserve">Designed and debugged PCBs and circuitry for a disinfectant robot.</w:t>
-      </w:r>
-    </w:p>
-    <w:p>
-      <w:pPr>
-        <w:pStyle w:val="Compact"/>
-        <w:numPr>
-          <w:ilvl w:val="0"/>
-          <w:numId w:val="1007"/>
-        </w:numPr>
-      </w:pPr>
-      <w:r>
-        <w:t xml:space="preserve">Performed maintenance on 3D printers and developed custom Marlin firmware in C++ to improve print reliability.</w:t>
-      </w:r>
-    </w:p>
-    <w:p>
-      <w:pPr>
-        <w:pStyle w:val="EntryHeader"/>
-      </w:pPr>
-      <w:r>
-        <w:rPr>
-          <w:b/>
-          <w:bCs/>
-        </w:rPr>
-        <w:t xml:space="preserve">Technology Instructor (Part Time / Full Time), Nullspace Group</w:t>
-      </w:r>
-      <w:r>
-        <w:br/>
-      </w:r>
-      <w:r>
-        <w:t xml:space="preserve">Nov 2016 – Present</w:t>
-      </w:r>
-    </w:p>
-    <w:p>
-      <w:pPr>
-        <w:pStyle w:val="Compact"/>
-        <w:numPr>
-          <w:ilvl w:val="0"/>
-          <w:numId w:val="1008"/>
-        </w:numPr>
-      </w:pPr>
-      <w:r>
-        <w:t xml:space="preserve">Instruct students aged 5–17 in STEM-focused courses covering computational thinking, programming (C++, Python), robotics, and microcontrollers, as an MOE-certified instructor from age 18.</w:t>
-      </w:r>
-    </w:p>
-    <w:bookmarkEnd w:id="21"/>
-    <w:bookmarkStart w:id="22" w:name="education"/>
-    <w:p>
-      <w:pPr>
-        <w:pStyle w:val="Heading1"/>
-      </w:pPr>
-      <w:r>
-        <w:t xml:space="preserve">EDUCATION</w:t>
-      </w:r>
-    </w:p>
-    <w:p>
-      <w:pPr>
-        <w:pStyle w:val="EntryHeader"/>
-      </w:pPr>
-      <w:r>
-        <w:rPr>
-          <w:b/>
-          <w:bCs/>
-        </w:rPr>
-        <w:t xml:space="preserve">DigiPen Institute of Technology &amp; SIT</w:t>
-      </w:r>
-      <w:r>
-        <w:br/>
-      </w:r>
-      <w:r>
-        <w:t xml:space="preserve">Aug 2023 – May 2027</w:t>
-      </w:r>
-    </w:p>
-    <w:p>
-      <w:pPr>
-        <w:pStyle w:val="Compact"/>
-        <w:numPr>
-          <w:ilvl w:val="0"/>
-          <w:numId w:val="1009"/>
-        </w:numPr>
-      </w:pPr>
-      <w:r>
-        <w:t xml:space="preserve">B.Eng. Mechatronics Systems</w:t>
-      </w:r>
-    </w:p>
-    <w:p>
-      <w:pPr>
-        <w:pStyle w:val="Compact"/>
-        <w:numPr>
-          <w:ilvl w:val="0"/>
-          <w:numId w:val="1009"/>
-        </w:numPr>
-      </w:pPr>
-      <w:r>
-        <w:t xml:space="preserve">Relevant Coursework: Mechanics, Control Systems, Robotics, Embedded Systems, Machine Learning, Systems and Software Engineering</w:t>
-      </w:r>
-    </w:p>
-    <w:p>
-      <w:pPr>
-        <w:pStyle w:val="EntryHeader"/>
-      </w:pPr>
-      <w:r>
-        <w:rPr>
-          <w:b/>
-          <w:bCs/>
-        </w:rPr>
-        <w:t xml:space="preserve">Ngee Ann Polytechnic</w:t>
-      </w:r>
-      <w:r>
-        <w:br/>
-      </w:r>
-      <w:r>
-        <w:t xml:space="preserve">Sep 2022 – Sep 2023</w:t>
+        <w:t xml:space="preserve">Firmware &amp; Perception</w:t>
       </w:r>
     </w:p>
     <w:p>
@@ -528,7 +560,7 @@
         </w:numPr>
       </w:pPr>
       <w:r>
-        <w:t xml:space="preserve">Specialist Diploma in Robotics Engineering (SGInnovate PowerX)</w:t>
+        <w:t xml:space="preserve">Built LiDAR-based perception in C++ and ROS for a robot that autonomously returns airport trolleys, developing and integrating obstacle detection, SLAM mapping, and localization with IMU and wheel-odometry sensor fusion on an onboard computer, completing the final demo task.</w:t>
       </w:r>
     </w:p>
     <w:p>
@@ -540,49 +572,7 @@
         </w:numPr>
       </w:pPr>
       <w:r>
-        <w:t xml:space="preserve">Relevant Coursework: Autonomous Robot Navigation, Machine Learning/Deep Learning for Robotics, Computer Vision</w:t>
-      </w:r>
-    </w:p>
-    <w:p>
-      <w:pPr>
-        <w:pStyle w:val="EntryHeader"/>
-      </w:pPr>
-      <w:r>
-        <w:rPr>
-          <w:b/>
-          <w:bCs/>
-        </w:rPr>
-        <w:t xml:space="preserve">Singapore Polytechnic</w:t>
-      </w:r>
-      <w:r>
-        <w:br/>
-      </w:r>
-      <w:r>
-        <w:t xml:space="preserve">Apr 2017 – Sep 2020</w:t>
-      </w:r>
-    </w:p>
-    <w:p>
-      <w:pPr>
-        <w:pStyle w:val="Compact"/>
-        <w:numPr>
-          <w:ilvl w:val="0"/>
-          <w:numId w:val="1011"/>
-        </w:numPr>
-      </w:pPr>
-      <w:r>
-        <w:t xml:space="preserve">Diploma in Mechatronics and Robotics</w:t>
-      </w:r>
-    </w:p>
-    <w:p>
-      <w:pPr>
-        <w:pStyle w:val="Compact"/>
-        <w:numPr>
-          <w:ilvl w:val="0"/>
-          <w:numId w:val="1011"/>
-        </w:numPr>
-      </w:pPr>
-      <w:r>
-        <w:t xml:space="preserve">Internship grade of B+; coursework in Microcontroller Applications, PLCs, and Robotics Integration</w:t>
+        <w:t xml:space="preserve">Developed RTOS firmware on an STM32F7 microcontroller with concurrent tasks for obstacle detection and joystick control, and a custom serial protocol linking it to ROS for reliable motor control.</w:t>
       </w:r>
     </w:p>
     <w:bookmarkEnd w:id="22"/>
@@ -700,11 +690,11 @@
         <w:pStyle w:val="Compact"/>
         <w:numPr>
           <w:ilvl w:val="0"/>
-          <w:numId w:val="1012"/>
-        </w:numPr>
-      </w:pPr>
-      <w:r>
-        <w:t xml:space="preserve">MOE (Ministry of Education) Instructor Certification (Achieved at age 18) — Valid Oct 2018 – Oct 2026</w:t>
+          <w:numId w:val="1011"/>
+        </w:numPr>
+      </w:pPr>
+      <w:r>
+        <w:t xml:space="preserve">MOE (Ministry of Education) Instructor Certification (Achieved at age 18) — Valid Oct 2018 – Oct 2026 (renewing)</w:t>
       </w:r>
     </w:p>
     <w:bookmarkEnd w:id="24"/>
@@ -740,39 +730,18 @@
         <w:pStyle w:val="Compact"/>
         <w:numPr>
           <w:ilvl w:val="0"/>
-          <w:numId w:val="1013"/>
-        </w:numPr>
-      </w:pPr>
-      <w:r>
-        <w:t xml:space="preserve">Supported event operations, workshops, logistics, and attendee experience at ROSCon Singapore 2025, the annual ROS developer conference.</w:t>
-      </w:r>
-    </w:p>
-    <w:p>
-      <w:pPr>
-        <w:pStyle w:val="EntryHeader"/>
-      </w:pPr>
-      <w:r>
-        <w:rPr>
-          <w:b/>
-          <w:bCs/>
-        </w:rPr>
-        <w:t xml:space="preserve">SG Makers Against COVID-19</w:t>
-      </w:r>
-    </w:p>
-    <w:p>
-      <w:pPr>
-        <w:pStyle w:val="Compact"/>
-        <w:numPr>
-          <w:ilvl w:val="0"/>
-          <w:numId w:val="1014"/>
-        </w:numPr>
-      </w:pPr>
-      <w:r>
-        <w:t xml:space="preserve">Initiated a pandemic response project to 3D-print ear savers for SingHealth and the local community, distributing over 10,000 units (Featured on Channel News Asia).</w:t>
+          <w:numId w:val="1012"/>
+        </w:numPr>
+      </w:pPr>
+      <w:r>
+        <w:t xml:space="preserve">Supported event operations, logistics, and attendee experience at ROSCon Singapore 2025, the annual ROS developer conference with ~1,000 participants from 52 countries, including helping run 3 workshops.</w:t>
       </w:r>
     </w:p>
     <w:bookmarkEnd w:id="25"/>
-    <w:sectPr/>
+    <w:sectPr>
+      <w:pgSz w:h="16838" w:w="11906"/>
+      <w:pgMar w:bottom="1224" w:footer="0" w:gutter="0" w:header="0" w:left="1224" w:right="1224" w:top="1008"/>
+    </w:sectPr>
   </w:body>
 </w:document>
 </file>
@@ -993,12 +962,6 @@
   <w:num w:numId="1012">
     <w:abstractNumId w:val="991"/>
   </w:num>
-  <w:num w:numId="1013">
-    <w:abstractNumId w:val="991"/>
-  </w:num>
-  <w:num w:numId="1014">
-    <w:abstractNumId w:val="991"/>
-  </w:num>
 </w:numbering>
 </file>
 
@@ -1015,7 +978,7 @@
     </w:rPrDefault>
     <w:pPrDefault>
       <w:pPr>
-        <w:spacing w:after="200"/>
+        <w:spacing w:after="0" w:before="0" w:line="240" w:lineRule="auto"/>
       </w:pPr>
     </w:pPrDefault>
   </w:docDefaults>
@@ -1024,7 +987,7 @@
     <w:name w:val="Normal"/>
     <w:qFormat/>
     <w:rPr>
-      <w:sz w:val="18"/>
+      <w:sz w:val="17"/>
     </w:rPr>
   </w:style>
   <w:style w:styleId="BodyText" w:type="paragraph">
@@ -1033,7 +996,7 @@
     <w:link w:val="BodyTextChar"/>
     <w:qFormat/>
     <w:pPr>
-      <w:spacing w:after="180" w:before="180"/>
+      <w:spacing w:after="0" w:before="0"/>
     </w:pPr>
   </w:style>
   <w:style w:customStyle="1" w:styleId="FirstParagraph" w:type="paragraph">
@@ -1047,7 +1010,7 @@
     <w:basedOn w:val="BodyText"/>
     <w:qFormat/>
     <w:pPr>
-      <w:spacing w:after="36" w:before="36"/>
+      <w:spacing w:after="20" w:before="0"/>
     </w:pPr>
   </w:style>
   <w:style w:styleId="Title" w:type="paragraph">
@@ -1066,7 +1029,7 @@
       <w:b/>
       <w:bCs/>
       <w:color w:themeColor="accent1" w:themeShade="B5" w:val="1F4E79"/>
-      <w:sz w:val="36"/>
+      <w:sz w:val="35"/>
       <w:szCs w:val="36"/>
     </w:rPr>
   </w:style>
@@ -1159,7 +1122,7 @@
       <w:pBdr>
         <w:bottom w:color="808080" w:space="4" w:sz="6" w:val="single"/>
       </w:pBdr>
-      <w:spacing w:after="0" w:before="480"/>
+      <w:spacing w:after="120" w:before="200"/>
       <w:outlineLvl w:val="0"/>
     </w:pPr>
     <w:rPr>
@@ -1168,7 +1131,7 @@
       <w:bCs/>
       <w:caps/>
       <w:color w:themeColor="accent1" w:val="808080"/>
-      <w:sz w:val="30"/>
+      <w:sz w:val="29"/>
       <w:szCs w:val="32"/>
     </w:rPr>
   </w:style>
@@ -1512,18 +1475,19 @@
     <w:rPr>
       <w:b/>
       <w:color w:val="1F4E79"/>
-      <w:sz w:val="36"/>
+      <w:sz w:val="35"/>
     </w:rPr>
   </w:style>
   <w:style w:styleId="EntryHeader" w:type="paragraph">
     <w:name w:val="Entry Header"/>
     <w:basedOn w:val="Normal"/>
     <w:pPr>
+      <w:keepNext/>
+      <w:keepLines/>
       <w:spacing w:before="120"/>
     </w:pPr>
     <w:rPr>
-      <w:b/>
-      <w:sz w:val="24"/>
+      <w:sz w:val="23"/>
     </w:rPr>
   </w:style>
   <w:style w:type="paragraph" w:customStyle="1" w:styleId="SourceCode">

</xml_diff>